<commit_message>
Docs: polish the Car License manual (uncut slot cards, full-width settings figures, renumbered sections); bump AItraining
Co-Authored-By: Claude <noreply@anthropic.com>
</commit_message>
<xml_diff>
--- a/Lab_Manual_Car_Sign.docx
+++ b/Lab_Manual_Car_Sign.docx
@@ -29,7 +29,7 @@
           <w:color w:val="0F172A"/>
           <w:sz w:val="24"/>
         </w:rPr>
-        <w:t>A) Objective:</w:t>
+        <w:t>A) Objective &amp; Briefing:</w:t>
       </w:r>
     </w:p>
     <w:p>
@@ -80,7 +80,7 @@
           <w:rFonts w:ascii="Arial" w:hAnsi="Arial"/>
           <w:sz w:val="21"/>
         </w:rPr>
-        <w:t>To test 3-character road sign / car plate recognition (🟢 YES — MATCH / 🔴 NO — NOT MATCH) and export the trained model.</w:t>
+        <w:t>To test 3-character car license / sign recognition (🟢 YES — MATCH / 🔴 NO — NOT MATCH) and export the trained model.</w:t>
       </w:r>
     </w:p>
     <w:p>
@@ -106,7 +106,7 @@
           <w:b w:val="0"/>
           <w:sz w:val="21"/>
         </w:rPr>
-        <w:t>In this task, you will learn how to train and export a TensorFlow Lite model through data collection, image preprocessing, model training, and performance preview. Specifically, you will train a model that can read a 3-character road sign / car sign in sequence (such as A 1 2) and tell you whether the sign in front of the camera matches your target (🟢 YES — MATCH or 🔴 NO — NOT MATCH). Please remember to save your project regularly (File ▾ → Save) to avoid losing your work.</w:t>
+        <w:t>In this task, you will learn how to train and export a TensorFlow Lite model through data collection, image preprocessing, model training, and performance preview. Specifically, you will train a model that can read a 3-character car license / sign in sequence (such as A 1 2) and tell you whether the sign in front of the camera matches your target (🟢 YES — MATCH or 🔴 NO — NOT MATCH). Please remember to save your project regularly (File ▾ → Save) to avoid losing your work.</w:t>
       </w:r>
     </w:p>
     <w:p>
@@ -121,7 +121,7 @@
           <w:color w:val="0F172A"/>
           <w:sz w:val="24"/>
         </w:rPr>
-        <w:t>2. Opening the Project &amp; the Four Main Areas</w:t>
+        <w:t>1. Opening the Project &amp; the Four Main Areas</w:t>
       </w:r>
     </w:p>
     <w:p>
@@ -135,7 +135,7 @@
           <w:b w:val="0"/>
           <w:sz w:val="21"/>
         </w:rPr>
-        <w:t>Open the app. On the Start Page, find the 🛑 Car License Project (3-Char) card and click Get Started to start a new project, or click Open Project (.tmproj) to open a saved template/project file.</w:t>
+        <w:t>Open the app. On the Start Page, find the 🚗 Car License Project card and click Get Started to start a new project, or click Open Project (.tmproj) to open a saved template/project file.</w:t>
       </w:r>
     </w:p>
     <w:p>
@@ -192,7 +192,7 @@
           <w:color w:val="64748B"/>
           <w:sz w:val="17"/>
         </w:rPr>
-        <w:t>Figure 1 — Start Page: choose the 🛑 Car License Project (3-Char) card.</w:t>
+        <w:t>Figure 1 — Start Page: choose the 🚗 Car License Project card.</w:t>
       </w:r>
     </w:p>
     <w:p>
@@ -284,7 +284,7 @@
           <w:rFonts w:ascii="Arial" w:hAnsi="Arial"/>
           <w:sz w:val="21"/>
         </w:rPr>
-        <w:t xml:space="preserve"> – for typing the 3 letters or numbers on your road sign in order (e.g., A, 1, 2).</w:t>
+        <w:t xml:space="preserve"> – for typing the 3 letters or numbers on your car license in order (e.g., A, 1, 2).</w:t>
       </w:r>
     </w:p>
     <w:p>
@@ -362,7 +362,7 @@
           <w:color w:val="0F172A"/>
           <w:sz w:val="24"/>
         </w:rPr>
-        <w:t>3. Sample Area — Part A: Setting the Target Sign &amp; Collecting Samples</w:t>
+        <w:t>2. Sample Area — Part A: Setting the Target License &amp; Collecting Samples</w:t>
       </w:r>
     </w:p>
     <w:p>
@@ -518,7 +518,7 @@
                 <w:color w:val="7F1D1D"/>
                 <w:sz w:val="20"/>
               </w:rPr>
-              <w:t>Each character card collects photos of ONE single letter/number (not the whole 3-letter sign at once). This way the AI learns each character separately, and during Preview the app slices the whole sign into 3 boxes and checks each one by itself.</w:t>
+              <w:t>Each character card collects photos of ONE single letter/number (not the whole 3-character license at once). This way the AI learns each character separately, and during Preview the app slices the whole license into 3 boxes and checks each one by itself.</w:t>
             </w:r>
           </w:p>
         </w:tc>
@@ -741,7 +741,7 @@
           <w:color w:val="0F172A"/>
           <w:sz w:val="24"/>
         </w:rPr>
-        <w:t>4. Sample Area — Part B: Preprocessing the Samples (Edit Page)</w:t>
+        <w:t>3. Sample Area — Part B: Preprocessing the Samples (Edit Page)</w:t>
       </w:r>
     </w:p>
     <w:p>
@@ -1204,7 +1204,7 @@
           <w:color w:val="0F172A"/>
           <w:sz w:val="24"/>
         </w:rPr>
-        <w:t>5. Train Area — Setting Hyperparameters &amp; Training</w:t>
+        <w:t>4. Train Area — Setting Hyperparameters &amp; Training</w:t>
       </w:r>
     </w:p>
     <w:p>
@@ -2057,7 +2057,7 @@
                 <w:b w:val="0"/>
                 <w:sz w:val="17"/>
               </w:rPr>
-              <w:t>On</w:t>
+              <w:t>Off</w:t>
             </w:r>
           </w:p>
         </w:tc>
@@ -2089,7 +2089,7 @@
                 <w:b w:val="0"/>
                 <w:sz w:val="17"/>
               </w:rPr>
-              <w:t>Adds a “no letter here” class, so the AI can tell you when a box is empty.</w:t>
+              <w:t>Default is Off for the Car License Project so the AI focuses purely on your 3 characters and uses standard OOD/confidence checks; turn On only if you want an extra “no letter” class to replace OOD.</w:t>
             </w:r>
           </w:p>
         </w:tc>
@@ -2330,7 +2330,7 @@
           <w:color w:val="0F172A"/>
           <w:sz w:val="24"/>
         </w:rPr>
-        <w:t>6. Preview Area — Testing 3-Slot Sign Matching &amp; Exporting</w:t>
+        <w:t>5. Preview Area — Testing 3-Slot Matching &amp; Exporting</w:t>
       </w:r>
     </w:p>
     <w:p>
@@ -2529,7 +2529,7 @@
       <w:r>
         <w:drawing>
           <wp:inline xmlns:a="http://schemas.openxmlformats.org/drawingml/2006/main" xmlns:pic="http://schemas.openxmlformats.org/drawingml/2006/picture">
-            <wp:extent cx="5943600" cy="3714750"/>
+            <wp:extent cx="5943600" cy="4953000"/>
             <wp:docPr id="8" name="Picture 8"/>
             <wp:cNvGraphicFramePr>
               <a:graphicFrameLocks noChangeAspect="1"/>
@@ -2550,7 +2550,7 @@
                   <pic:spPr>
                     <a:xfrm>
                       <a:off x="0" y="0"/>
-                      <a:ext cx="5943600" cy="3714750"/>
+                      <a:ext cx="5943600" cy="4953000"/>
                     </a:xfrm>
                     <a:prstGeom prst="rect"/>
                   </pic:spPr>
@@ -2587,7 +2587,7 @@
       <w:r>
         <w:drawing>
           <wp:inline xmlns:a="http://schemas.openxmlformats.org/drawingml/2006/main" xmlns:pic="http://schemas.openxmlformats.org/drawingml/2006/picture">
-            <wp:extent cx="5943600" cy="3714750"/>
+            <wp:extent cx="5943600" cy="4953000"/>
             <wp:docPr id="9" name="Picture 9"/>
             <wp:cNvGraphicFramePr>
               <a:graphicFrameLocks noChangeAspect="1"/>
@@ -2608,7 +2608,7 @@
                   <pic:spPr>
                     <a:xfrm>
                       <a:off x="0" y="0"/>
-                      <a:ext cx="5943600" cy="3714750"/>
+                      <a:ext cx="5943600" cy="4953000"/>
                     </a:xfrm>
                     <a:prstGeom prst="rect"/>
                   </pic:spPr>
@@ -2645,7 +2645,7 @@
           <w:rFonts w:ascii="Arial" w:hAnsi="Arial"/>
           <w:sz w:val="21"/>
         </w:rPr>
-        <w:t>The app slices the detected sign horizontally into 3 character slots in your chosen reading direction.</w:t>
+        <w:t>The app slices the detected license horizontally into 3 character slots in your chosen reading direction.</w:t>
       </w:r>
     </w:p>
     <w:p>
@@ -2723,7 +2723,7 @@
       <w:r>
         <w:drawing>
           <wp:inline xmlns:a="http://schemas.openxmlformats.org/drawingml/2006/main" xmlns:pic="http://schemas.openxmlformats.org/drawingml/2006/picture">
-            <wp:extent cx="5943600" cy="3714750"/>
+            <wp:extent cx="5943600" cy="4953000"/>
             <wp:docPr id="10" name="Picture 10"/>
             <wp:cNvGraphicFramePr>
               <a:graphicFrameLocks noChangeAspect="1"/>
@@ -2744,7 +2744,7 @@
                   <pic:spPr>
                     <a:xfrm>
                       <a:off x="0" y="0"/>
-                      <a:ext cx="5943600" cy="3714750"/>
+                      <a:ext cx="5943600" cy="4953000"/>
                     </a:xfrm>
                     <a:prstGeom prst="rect"/>
                   </pic:spPr>
@@ -2782,7 +2782,7 @@
           <w:color w:val="1D4ED8"/>
           <w:sz w:val="21"/>
         </w:rPr>
-        <w:t>That's it — you collected letters, trained an AI to read them, tested a whole sign, and exported your model. Well done!</w:t>
+        <w:t>That's it — you collected letters, trained an AI to read them, tested a whole license, and exported your model. Well done!</w:t>
       </w:r>
     </w:p>
     <w:sectPr>

</xml_diff>

<commit_message>
Docs: cover the License List gatekeeper, img_size scaling and export contents in the Car License manual; bump AItraining
Co-Authored-By: Claude <noreply@anthropic.com>
</commit_message>
<xml_diff>
--- a/Lab_Manual_Car_Sign.docx
+++ b/Lab_Manual_Car_Sign.docx
@@ -375,7 +375,7 @@
           <w:b/>
           <w:sz w:val="21"/>
         </w:rPr>
-        <w:t>Setting the 3-Character Target Sign:</w:t>
+        <w:t>Setting the Target License (single plate):</w:t>
       </w:r>
     </w:p>
     <w:p>
@@ -402,7 +402,7 @@
           <w:rFonts w:ascii="Arial" w:hAnsi="Arial"/>
           <w:sz w:val="21"/>
         </w:rPr>
-        <w:t>If your sign uses the same character twice (like A 1 A), the app automatically keeps just one A card with a “Slots 1 &amp; 3” badge so you only need to collect samples for A once!</w:t>
+        <w:t>If your license uses the same character twice (like A 1 A), the app automatically keeps just one A card with a “Slots 1 &amp; 3” badge so you only need to collect samples for A once!</w:t>
       </w:r>
     </w:p>
     <w:p>
@@ -460,6 +460,58 @@
           <w:sz w:val="17"/>
         </w:rPr>
         <w:t>Figure 3 — The Target Sign Bar: typing characters, the ◀ / ▶ swap buttons and the duplicate-character badge.</w:t>
+      </w:r>
+    </w:p>
+    <w:p>
+      <w:pPr>
+        <w:spacing w:after="120"/>
+      </w:pPr>
+      <w:r>
+        <w:rPr>
+          <w:rFonts w:ascii="Arial" w:hAnsi="Arial"/>
+          <w:b/>
+          <w:sz w:val="21"/>
+        </w:rPr>
+        <w:t>Want your AI “gatekeeper” to accept more than one license plate?</w:t>
+      </w:r>
+    </w:p>
+    <w:p>
+      <w:pPr>
+        <w:pStyle w:val="ListBullet"/>
+        <w:spacing w:after="40"/>
+      </w:pPr>
+      <w:r>
+        <w:rPr>
+          <w:rFonts w:ascii="Arial" w:hAnsi="Arial"/>
+          <w:sz w:val="21"/>
+        </w:rPr>
+        <w:t>Click the 🪪 License List button next to ⚙ Settings in the top bar and add several allowed plates — for example both A 1 2 and B 1 8!</w:t>
+      </w:r>
+    </w:p>
+    <w:p>
+      <w:pPr>
+        <w:pStyle w:val="ListBullet"/>
+        <w:spacing w:after="40"/>
+      </w:pPr>
+      <w:r>
+        <w:rPr>
+          <w:rFonts w:ascii="Arial" w:hAnsi="Arial"/>
+          <w:sz w:val="21"/>
+        </w:rPr>
+        <w:t>The app automatically combines the unique letters/numbers of all your plates into the Sample Area cards, so a repeated character like 1 is only collected once.</w:t>
+      </w:r>
+    </w:p>
+    <w:p>
+      <w:pPr>
+        <w:pStyle w:val="ListBullet"/>
+        <w:spacing w:after="40"/>
+      </w:pPr>
+      <w:r>
+        <w:rPr>
+          <w:rFonts w:ascii="Arial" w:hAnsi="Arial"/>
+          <w:sz w:val="21"/>
+        </w:rPr>
+        <w:t>In Preview, the app shows 🟢 YES — MATCH whenever ANY plate on your allowed list is seen!</w:t>
       </w:r>
     </w:p>
     <w:p>
@@ -1220,6 +1272,19 @@
         <w:t>Next, move to the Train Area. After image processing is complete, click ▸ Advanced to view or adjust the training hyperparameters. Below is the table for each hyperparameter:</w:t>
       </w:r>
     </w:p>
+    <w:p>
+      <w:pPr>
+        <w:spacing w:after="120"/>
+      </w:pPr>
+      <w:r>
+        <w:rPr>
+          <w:rFonts w:ascii="Arial" w:hAnsi="Arial"/>
+          <w:b w:val="0"/>
+          <w:sz w:val="21"/>
+        </w:rPr>
+        <w:t>About the Image Size: even if the smart-car camera captures frames at 160×160 (set in ⚙ Settings), the app automatically scales every camera frame to match the model's input size — 96×96 for the picture preprocessing and 28×28 for each character slot. The exported model carries its img_size with it (in model_settings.h), so the car always scales the camera frames to exactly the size the model was trained on.</w:t>
+      </w:r>
+    </w:p>
     <w:tbl>
       <w:tblPr>
         <w:tblStyle w:val="TableGrid"/>
@@ -1579,7 +1644,7 @@
                 <w:b w:val="0"/>
                 <w:sz w:val="17"/>
               </w:rPr>
-              <w:t>How many pixels wide the small letter picture is. 28×28 fits one letter perfectly — leave it.</w:t>
+              <w:t>How many pixels wide the small letter picture is. 28×28 fits one letter perfectly — leave it. Whatever the camera sends (even 160×160), the app scales it to this size automatically.</w:t>
             </w:r>
           </w:p>
         </w:tc>
@@ -2041,7 +2106,7 @@
                 <w:b w:val="0"/>
                 <w:sz w:val="17"/>
               </w:rPr>
-              <w:t>Background / noise class</w:t>
+              <w:t>Use _background noise class to replace OOD rejection</w:t>
             </w:r>
           </w:p>
         </w:tc>
@@ -2703,6 +2768,19 @@
     <w:p>
       <w:pPr>
         <w:pStyle w:val="ListBullet"/>
+        <w:spacing w:after="40"/>
+      </w:pPr>
+      <w:r>
+        <w:rPr>
+          <w:rFonts w:ascii="Arial" w:hAnsi="Arial"/>
+          <w:sz w:val="21"/>
+        </w:rPr>
+        <w:t>The export packs in everything the car needs: the trained weights, the img_size scaling parameters, the _background / OOD settings, and the full list of your allowed license plates — all into model_settings.h. When the car sees a plate, the ESP32-P4 checks it against the list and tells the ESP32-S3 which specific plate number matched!</w:t>
+      </w:r>
+    </w:p>
+    <w:p>
+      <w:pPr>
+        <w:pStyle w:val="ListBullet"/>
         <w:keepNext/>
         <w:spacing w:after="40"/>
       </w:pPr>

</xml_diff>

<commit_message>
Docs: add the on-car placement guide (3 reserved photo boxes) and Serial Monitor verification (1 reserved box) to the Car License manual; bump AItraining
Co-Authored-By: Claude <noreply@anthropic.com>
</commit_message>
<xml_diff>
--- a/Lab_Manual_Car_Sign.docx
+++ b/Lab_Manual_Car_Sign.docx
@@ -485,7 +485,7 @@
           <w:rFonts w:ascii="Arial" w:hAnsi="Arial"/>
           <w:sz w:val="21"/>
         </w:rPr>
-        <w:t>Click the 🪪 License List button next to ⚙ Settings in the top bar and add several allowed plates — for example both A 1 2 and B 1 8!</w:t>
+        <w:t>Besides typing a single 3-character plate (A ▸ 1 ▸ 2), you can click the 🪪 License List button next to ⚙ Settings in the top bar and add one or more allowed license plates — just like a parking-lot gatekeeper that remembers multiple authorized cars (for example A 1 2 and B 1 8)!</w:t>
       </w:r>
     </w:p>
     <w:p>
@@ -498,7 +498,7 @@
           <w:rFonts w:ascii="Arial" w:hAnsi="Arial"/>
           <w:sz w:val="21"/>
         </w:rPr>
-        <w:t>The app automatically combines the unique letters/numbers of all your plates into the Sample Area cards, so a repeated character like 1 is only collected once.</w:t>
+        <w:t>Shared characters are automatically merged: a character like 1 that appears on several plates becomes ONE Sample Area card, so you only collect samples for each unique character once!</w:t>
       </w:r>
     </w:p>
     <w:p>
@@ -2749,6 +2749,248 @@
           <w:b/>
           <w:sz w:val="21"/>
         </w:rPr>
+        <w:t>Positioning the Smart Car and Checkpoint on the Map:</w:t>
+      </w:r>
+    </w:p>
+    <w:p>
+      <w:pPr>
+        <w:spacing w:after="120"/>
+      </w:pPr>
+      <w:r>
+        <w:rPr>
+          <w:rFonts w:ascii="Arial" w:hAnsi="Arial"/>
+          <w:b w:val="0"/>
+          <w:sz w:val="21"/>
+        </w:rPr>
+        <w:t>Before testing with the real car camera, place the car and the checkpoint stand exactly as shown below — the right placement lets the RFID Reader read the tag and gives the camera the perfect view of the license plate.</w:t>
+      </w:r>
+    </w:p>
+    <w:p>
+      <w:pPr>
+        <w:pStyle w:val="ListBullet"/>
+        <w:spacing w:after="40"/>
+      </w:pPr>
+      <w:r>
+        <w:rPr>
+          <w:rFonts w:ascii="Arial" w:hAnsi="Arial"/>
+          <w:sz w:val="21"/>
+        </w:rPr>
+        <w:t>First, find the green RFID Reader mounted underneath the smart car chassis (between the two wheels). Locate it first, because its position is used to align the car on the map edge!</w:t>
+      </w:r>
+    </w:p>
+    <w:tbl>
+      <w:tblPr>
+        <w:tblW w:type="auto" w:w="0"/>
+        <w:jc w:val="center"/>
+        <w:tblLook w:firstColumn="1" w:firstRow="1" w:lastColumn="0" w:lastRow="0" w:noHBand="0" w:noVBand="1" w:val="04A0"/>
+      </w:tblPr>
+      <w:tblGrid>
+        <w:gridCol w:w="9360"/>
+      </w:tblGrid>
+      <w:tr>
+        <w:tc>
+          <w:tcPr>
+            <w:tcW w:type="dxa" w:w="9360"/>
+            <w:shd w:val="clear" w:color="auto" w:fill="F8FAFC"/>
+            <w:tcBorders>
+              <w:top w:val="single" w:sz="14" w:space="0" w:color="94A3B8"/>
+              <w:left w:val="single" w:sz="14" w:space="0" w:color="94A3B8"/>
+              <w:bottom w:val="single" w:sz="14" w:space="0" w:color="94A3B8"/>
+              <w:right w:val="single" w:sz="14" w:space="0" w:color="94A3B8"/>
+            </w:tcBorders>
+          </w:tcPr>
+          <w:p>
+            <w:pPr>
+              <w:spacing w:before="80" w:after="40"/>
+              <w:jc w:val="center"/>
+            </w:pPr>
+            <w:r>
+              <w:rPr>
+                <w:rFonts w:ascii="Arial" w:hAnsi="Arial"/>
+                <w:b/>
+                <w:color w:val="334155"/>
+                <w:sz w:val="21"/>
+              </w:rPr>
+              <w:t>📷 [Reserved Image 1 — Photo of Smart Car Underside Showing Green RFID Reader]</w:t>
+            </w:r>
+          </w:p>
+          <w:p>
+            <w:pPr>
+              <w:spacing w:after="80"/>
+              <w:jc w:val="center"/>
+            </w:pPr>
+            <w:r>
+              <w:rPr>
+                <w:rFonts w:ascii="Arial" w:hAnsi="Arial"/>
+                <w:i/>
+                <w:color w:val="64748B"/>
+                <w:sz w:val="18"/>
+              </w:rPr>
+              <w:t>(Reserved space — drop the photo here)</w:t>
+            </w:r>
+          </w:p>
+        </w:tc>
+      </w:tr>
+    </w:tbl>
+    <w:p>
+      <w:pPr>
+        <w:spacing w:after="40"/>
+      </w:pPr>
+    </w:p>
+    <w:p>
+      <w:pPr>
+        <w:spacing w:after="120"/>
+      </w:pPr>
+      <w:r>
+        <w:rPr>
+          <w:rFonts w:ascii="Arial" w:hAnsi="Arial"/>
+          <w:b w:val="0"/>
+          <w:sz w:val="21"/>
+        </w:rPr>
+        <w:t>Place the smart car on the starting edge of the white map with the front IR line-tracking sensors over the black line. The vertical projection (shadow) of the REAR edge (back end) of the RFID Reader should sit right along the outer edge of the white map. At this exact position, the RFID Reader is just inside the map edge and can reliably detect the tag, while the camera gets the ideal distance to view the checkpoint sign.</w:t>
+      </w:r>
+    </w:p>
+    <w:tbl>
+      <w:tblPr>
+        <w:tblW w:type="auto" w:w="0"/>
+        <w:jc w:val="center"/>
+        <w:tblLook w:firstColumn="1" w:firstRow="1" w:lastColumn="0" w:lastRow="0" w:noHBand="0" w:noVBand="1" w:val="04A0"/>
+      </w:tblPr>
+      <w:tblGrid>
+        <w:gridCol w:w="9360"/>
+      </w:tblGrid>
+      <w:tr>
+        <w:tc>
+          <w:tcPr>
+            <w:tcW w:type="dxa" w:w="9360"/>
+            <w:shd w:val="clear" w:color="auto" w:fill="F8FAFC"/>
+            <w:tcBorders>
+              <w:top w:val="single" w:sz="14" w:space="0" w:color="94A3B8"/>
+              <w:left w:val="single" w:sz="14" w:space="0" w:color="94A3B8"/>
+              <w:bottom w:val="single" w:sz="14" w:space="0" w:color="94A3B8"/>
+              <w:right w:val="single" w:sz="14" w:space="0" w:color="94A3B8"/>
+            </w:tcBorders>
+          </w:tcPr>
+          <w:p>
+            <w:pPr>
+              <w:spacing w:before="80" w:after="40"/>
+              <w:jc w:val="center"/>
+            </w:pPr>
+            <w:r>
+              <w:rPr>
+                <w:rFonts w:ascii="Arial" w:hAnsi="Arial"/>
+                <w:b/>
+                <w:color w:val="334155"/>
+                <w:sz w:val="21"/>
+              </w:rPr>
+              <w:t>📷 [Reserved Image 2 — Photo of Smart Car Aligned at the Edge of the Map]</w:t>
+            </w:r>
+          </w:p>
+          <w:p>
+            <w:pPr>
+              <w:spacing w:after="80"/>
+              <w:jc w:val="center"/>
+            </w:pPr>
+            <w:r>
+              <w:rPr>
+                <w:rFonts w:ascii="Arial" w:hAnsi="Arial"/>
+                <w:i/>
+                <w:color w:val="64748B"/>
+                <w:sz w:val="18"/>
+              </w:rPr>
+              <w:t>(Reserved space — drop the photo here)</w:t>
+            </w:r>
+          </w:p>
+        </w:tc>
+      </w:tr>
+    </w:tbl>
+    <w:p>
+      <w:pPr>
+        <w:spacing w:after="40"/>
+      </w:pPr>
+    </w:p>
+    <w:p>
+      <w:pPr>
+        <w:spacing w:after="120"/>
+      </w:pPr>
+      <w:r>
+        <w:rPr>
+          <w:rFonts w:ascii="Arial" w:hAnsi="Arial"/>
+          <w:b w:val="0"/>
+          <w:sz w:val="21"/>
+        </w:rPr>
+        <w:t>Place the checkpoint stand so its square clear acrylic base is rotated at a 45° angle, with the corner tip of the acrylic base just touching (tangent to) the straight black line. This guarantees the camera faces the 3-character license plate at the optimal angle while keeping the track clear.</w:t>
+      </w:r>
+    </w:p>
+    <w:tbl>
+      <w:tblPr>
+        <w:tblW w:type="auto" w:w="0"/>
+        <w:jc w:val="center"/>
+        <w:tblLook w:firstColumn="1" w:firstRow="1" w:lastColumn="0" w:lastRow="0" w:noHBand="0" w:noVBand="1" w:val="04A0"/>
+      </w:tblPr>
+      <w:tblGrid>
+        <w:gridCol w:w="9360"/>
+      </w:tblGrid>
+      <w:tr>
+        <w:tc>
+          <w:tcPr>
+            <w:tcW w:type="dxa" w:w="9360"/>
+            <w:shd w:val="clear" w:color="auto" w:fill="F8FAFC"/>
+            <w:tcBorders>
+              <w:top w:val="single" w:sz="14" w:space="0" w:color="94A3B8"/>
+              <w:left w:val="single" w:sz="14" w:space="0" w:color="94A3B8"/>
+              <w:bottom w:val="single" w:sz="14" w:space="0" w:color="94A3B8"/>
+              <w:right w:val="single" w:sz="14" w:space="0" w:color="94A3B8"/>
+            </w:tcBorders>
+          </w:tcPr>
+          <w:p>
+            <w:pPr>
+              <w:spacing w:before="80" w:after="40"/>
+              <w:jc w:val="center"/>
+            </w:pPr>
+            <w:r>
+              <w:rPr>
+                <w:rFonts w:ascii="Arial" w:hAnsi="Arial"/>
+                <w:b/>
+                <w:color w:val="334155"/>
+                <w:sz w:val="21"/>
+              </w:rPr>
+              <w:t>📷 [Reserved Image 3 — Photo of Checkpoint Acrylic Base Tangent to the Black Line at 45°]</w:t>
+            </w:r>
+          </w:p>
+          <w:p>
+            <w:pPr>
+              <w:spacing w:after="80"/>
+              <w:jc w:val="center"/>
+            </w:pPr>
+            <w:r>
+              <w:rPr>
+                <w:rFonts w:ascii="Arial" w:hAnsi="Arial"/>
+                <w:i/>
+                <w:color w:val="64748B"/>
+                <w:sz w:val="18"/>
+              </w:rPr>
+              <w:t>(Reserved space — drop the photo here)</w:t>
+            </w:r>
+          </w:p>
+        </w:tc>
+      </w:tr>
+    </w:tbl>
+    <w:p>
+      <w:pPr>
+        <w:spacing w:after="40"/>
+      </w:pPr>
+    </w:p>
+    <w:p>
+      <w:pPr>
+        <w:spacing w:after="120"/>
+      </w:pPr>
+      <w:r>
+        <w:rPr>
+          <w:rFonts w:ascii="Arial" w:hAnsi="Arial"/>
+          <w:b/>
+          <w:sz w:val="21"/>
+        </w:rPr>
         <w:t>Exporting the Model &amp; Saving Your Project:</w:t>
       </w:r>
     </w:p>
@@ -2857,10 +3099,160 @@
         <w:rPr>
           <w:rFonts w:ascii="Arial" w:hAnsi="Arial"/>
           <w:b/>
+          <w:sz w:val="21"/>
+        </w:rPr>
+        <w:t>On-Car Verification (Arduino Serial Monitor):</w:t>
+      </w:r>
+    </w:p>
+    <w:p>
+      <w:pPr>
+        <w:spacing w:after="120"/>
+      </w:pPr>
+      <w:r>
+        <w:rPr>
+          <w:rFonts w:ascii="Arial" w:hAnsi="Arial"/>
+          <w:b w:val="0"/>
+          <w:sz w:val="21"/>
+        </w:rPr>
+        <w:t>After exporting the model into the TFLite_Sign/ folder and uploading TFLite_Sign.ino to the ESP32-P4, open the Arduino IDE Serial Monitor (921600 baud). When the car reads a license plate, you will see an output line like this:</w:t>
+      </w:r>
+    </w:p>
+    <w:tbl>
+      <w:tblPr>
+        <w:tblW w:type="auto" w:w="0"/>
+        <w:jc w:val="center"/>
+        <w:tblLook w:firstColumn="1" w:firstRow="1" w:lastColumn="0" w:lastRow="0" w:noHBand="0" w:noVBand="1" w:val="04A0"/>
+      </w:tblPr>
+      <w:tblGrid>
+        <w:gridCol w:w="9360"/>
+      </w:tblGrid>
+      <w:tr>
+        <w:tc>
+          <w:tcPr>
+            <w:tcW w:type="dxa" w:w="9360"/>
+            <w:shd w:val="clear" w:color="auto" w:fill="F1F5F9"/>
+            <w:tcBorders>
+              <w:top w:val="single" w:sz="10" w:space="0" w:color="CBD5E1"/>
+              <w:left w:val="single" w:sz="10" w:space="0" w:color="CBD5E1"/>
+              <w:bottom w:val="single" w:sz="10" w:space="0" w:color="CBD5E1"/>
+              <w:right w:val="single" w:sz="10" w:space="0" w:color="CBD5E1"/>
+            </w:tcBorders>
+          </w:tcPr>
+          <w:p>
+            <w:r>
+              <w:rPr>
+                <w:rFonts w:ascii="Consolas" w:hAnsi="Consolas"/>
+                <w:color w:val="0F172A"/>
+                <w:sz w:val="18"/>
+              </w:rPr>
+              <w:t>SIGN: MATCH (YES) plate=A12 [0] 'A'-&gt;A 0.95 [1] '1'-&gt;1 0.86 [2] '2'-&gt;2 0.78</w:t>
+            </w:r>
+          </w:p>
+        </w:tc>
+      </w:tr>
+    </w:tbl>
+    <w:p>
+      <w:pPr>
+        <w:spacing w:after="40"/>
+      </w:pPr>
+    </w:p>
+    <w:p>
+      <w:pPr>
+        <w:pStyle w:val="ListBullet"/>
+        <w:spacing w:after="40"/>
+      </w:pPr>
+      <w:r>
+        <w:rPr>
+          <w:rFonts w:ascii="Arial" w:hAnsi="Arial"/>
+          <w:sz w:val="21"/>
+        </w:rPr>
+        <w:t>Each slot [0], [1], [2] prints the character the AI predicted and its confidence score — for example [1] '1'-&gt;1 0.86 means slot 1 read the character '1' with 86% confidence.</w:t>
+      </w:r>
+    </w:p>
+    <w:p>
+      <w:pPr>
+        <w:pStyle w:val="ListBullet"/>
+        <w:spacing w:after="40"/>
+      </w:pPr>
+      <w:r>
+        <w:rPr>
+          <w:rFonts w:ascii="Arial" w:hAnsi="Arial"/>
+          <w:sz w:val="21"/>
+        </w:rPr>
+        <w:t>The verdict MATCH (flags=0x02) tells the ESP32-S3 which authorized license plate matched (plate=A12), so the car can execute the corresponding action!</w:t>
+      </w:r>
+    </w:p>
+    <w:tbl>
+      <w:tblPr>
+        <w:tblW w:type="auto" w:w="0"/>
+        <w:jc w:val="center"/>
+        <w:tblLook w:firstColumn="1" w:firstRow="1" w:lastColumn="0" w:lastRow="0" w:noHBand="0" w:noVBand="1" w:val="04A0"/>
+      </w:tblPr>
+      <w:tblGrid>
+        <w:gridCol w:w="9360"/>
+      </w:tblGrid>
+      <w:tr>
+        <w:tc>
+          <w:tcPr>
+            <w:tcW w:type="dxa" w:w="9360"/>
+            <w:shd w:val="clear" w:color="auto" w:fill="F8FAFC"/>
+            <w:tcBorders>
+              <w:top w:val="single" w:sz="14" w:space="0" w:color="94A3B8"/>
+              <w:left w:val="single" w:sz="14" w:space="0" w:color="94A3B8"/>
+              <w:bottom w:val="single" w:sz="14" w:space="0" w:color="94A3B8"/>
+              <w:right w:val="single" w:sz="14" w:space="0" w:color="94A3B8"/>
+            </w:tcBorders>
+          </w:tcPr>
+          <w:p>
+            <w:pPr>
+              <w:spacing w:before="80" w:after="40"/>
+              <w:jc w:val="center"/>
+            </w:pPr>
+            <w:r>
+              <w:rPr>
+                <w:rFonts w:ascii="Arial" w:hAnsi="Arial"/>
+                <w:b/>
+                <w:color w:val="334155"/>
+                <w:sz w:val="21"/>
+              </w:rPr>
+              <w:t>📷 [Reserved Image 4 — Screenshot of Arduino IDE TFLite_Sign.ino Serial Monitor Output]</w:t>
+            </w:r>
+          </w:p>
+          <w:p>
+            <w:pPr>
+              <w:spacing w:after="80"/>
+              <w:jc w:val="center"/>
+            </w:pPr>
+            <w:r>
+              <w:rPr>
+                <w:rFonts w:ascii="Arial" w:hAnsi="Arial"/>
+                <w:i/>
+                <w:color w:val="64748B"/>
+                <w:sz w:val="18"/>
+              </w:rPr>
+              <w:t>(Reserved space — drop the photo here)</w:t>
+            </w:r>
+          </w:p>
+        </w:tc>
+      </w:tr>
+    </w:tbl>
+    <w:p>
+      <w:pPr>
+        <w:spacing w:after="40"/>
+      </w:pPr>
+    </w:p>
+    <w:p>
+      <w:pPr>
+        <w:spacing w:after="120"/>
+      </w:pPr>
+      <w:r>
+        <w:rPr>
+          <w:rFonts w:ascii="Arial" w:hAnsi="Arial"/>
+          <w:b/>
           <w:color w:val="1D4ED8"/>
           <w:sz w:val="21"/>
         </w:rPr>
-        <w:t>That's it — you collected letters, trained an AI to read them, tested a whole license, and exported your model. Well done!</w:t>
+        <w:t>That's it — you collected letters, trained an AI to read them, tested a whole license, exported your model and watched it recognize a plate on the car. Well done!</w:t>
       </w:r>
     </w:p>
     <w:sectPr>

</xml_diff>